<commit_message>
Endurecer servicio ante caidas y duplicados
</commit_message>
<xml_diff>
--- a/entrega/PUDS_INF513_P1_Grupo09SA.docx
+++ b/entrega/PUDS_INF513_P1_Grupo09SA.docx
@@ -463,7 +463,7 @@
         <w:spacing w:after="120" w:line="259" w:lineRule="auto"/>
       </w:pPr>
       <w:r>
-        <w:t>La comprobación integral se realizó el 12 de octubre de 2026. Un correo externo envió AYUDA[] y LISCON["*"]; el servicio leyó ambos mensajes, procesó la consulta en la base de datos y respondió al mismo Gmail con el asunto ÉXITO - Orden procesada. Gmail colocó las respuestas en Spam por tratarse de un remitente institucional nuevo; la entrega y el contenido se verificaron.</w:t>
+        <w:t>La comprobación integral se realizó el 12 de octubre de 2026. Un correo externo solicitó el catálogo de ayuda y envió LISCON["*"]; el servicio leyó ambos mensajes, procesó la consulta en la base de datos y respondió al mismo Gmail con el asunto ÉXITO - Orden procesada. Gmail colocó las respuestas en Spam por tratarse de un remitente institucional nuevo; la entrega y el contenido se verificaron.</w:t>
       </w:r>
     </w:p>
     <w:p>
@@ -4163,6 +4163,116 @@
           </w:tcPr>
           <w:p>
             <w:pPr>
+              <w:jc w:val="center"/>
+            </w:pPr>
+            <w:r/>
+            <w:r>
+              <w:rPr>
+                <w:b w:val="0"/>
+                <w:color w:val="000000"/>
+                <w:sz w:val="17"/>
+              </w:rPr>
+              <w:t>p1_correo_control</w:t>
+            </w:r>
+          </w:p>
+        </w:tc>
+        <w:tc>
+          <w:tcPr>
+            <w:tcW w:type="dxa" w:w="6480"/>
+            <w:shd w:fill="F4F7FB"/>
+            <w:vAlign w:val="center"/>
+            <w:tcMar>
+              <w:top w:w="90" w:type="dxa"/>
+              <w:left w:w="90" w:type="dxa"/>
+              <w:bottom w:w="90" w:type="dxa"/>
+              <w:right w:w="90" w:type="dxa"/>
+            </w:tcMar>
+          </w:tcPr>
+          <w:p>
+            <w:pPr>
+              <w:jc w:val="left"/>
+            </w:pPr>
+            <w:r/>
+            <w:r>
+              <w:rPr>
+                <w:b w:val="0"/>
+                <w:color w:val="000000"/>
+                <w:sz w:val="17"/>
+              </w:rPr>
+              <w:t>Estado, reintentos y respuesta pendiente.</w:t>
+            </w:r>
+          </w:p>
+        </w:tc>
+      </w:tr>
+      <w:tr>
+        <w:tc>
+          <w:tcPr>
+            <w:tcW w:type="dxa" w:w="3024"/>
+            <w:vAlign w:val="center"/>
+            <w:tcMar>
+              <w:top w:w="90" w:type="dxa"/>
+              <w:left w:w="90" w:type="dxa"/>
+              <w:bottom w:w="90" w:type="dxa"/>
+              <w:right w:w="90" w:type="dxa"/>
+            </w:tcMar>
+          </w:tcPr>
+          <w:p>
+            <w:pPr>
+              <w:jc w:val="left"/>
+            </w:pPr>
+            <w:r/>
+            <w:r>
+              <w:rPr>
+                <w:b w:val="0"/>
+                <w:color w:val="000000"/>
+                <w:sz w:val="17"/>
+              </w:rPr>
+              <w:t>p1_resultado_orden</w:t>
+            </w:r>
+          </w:p>
+        </w:tc>
+        <w:tc>
+          <w:tcPr>
+            <w:tcW w:type="dxa" w:w="6480"/>
+            <w:vAlign w:val="center"/>
+            <w:tcMar>
+              <w:top w:w="90" w:type="dxa"/>
+              <w:left w:w="90" w:type="dxa"/>
+              <w:bottom w:w="90" w:type="dxa"/>
+              <w:right w:w="90" w:type="dxa"/>
+            </w:tcMar>
+          </w:tcPr>
+          <w:p>
+            <w:pPr>
+              <w:jc w:val="left"/>
+            </w:pPr>
+            <w:r/>
+            <w:r>
+              <w:rPr>
+                <w:b w:val="0"/>
+                <w:color w:val="000000"/>
+                <w:sz w:val="17"/>
+              </w:rPr>
+              <w:t>Resultado idempotente transaccional.</w:t>
+            </w:r>
+          </w:p>
+        </w:tc>
+      </w:tr>
+      <w:tr>
+        <w:tc>
+          <w:tcPr>
+            <w:tcW w:type="dxa" w:w="3024"/>
+            <w:shd w:fill="F4F7FB"/>
+            <w:vAlign w:val="center"/>
+            <w:tcMar>
+              <w:top w:w="90" w:type="dxa"/>
+              <w:left w:w="90" w:type="dxa"/>
+              <w:bottom w:w="90" w:type="dxa"/>
+              <w:right w:w="90" w:type="dxa"/>
+            </w:tcMar>
+          </w:tcPr>
+          <w:p>
+            <w:pPr>
               <w:jc w:val="left"/>
             </w:pPr>
             <w:r/>
@@ -4199,7 +4309,7 @@
                 <w:color w:val="000000"/>
                 <w:sz w:val="17"/>
               </w:rPr>
-              <w:t>UID del correo para garantizar idempotencia.</w:t>
+              <w:t>UID de los correos respondidos.</w:t>
             </w:r>
           </w:p>
         </w:tc>
@@ -4215,7 +4325,7 @@
         <w:spacing w:after="120" w:line="259" w:lineRule="auto"/>
       </w:pPr>
       <w:r>
-        <w:t>Las tablas usan el prefijo p1_ para convivir con otros proyectos del grupo sin alterar sus datos. Las consultas de entrada emplean sentencias preparadas. La postulación y su expediente se guardan dentro de una transacción.</w:t>
+        <w:t>Las tablas usan el prefijo p1_ para convivir con otros proyectos del grupo sin alterar sus datos. Las consultas emplean sentencias preparadas. Cada operación, su auditoría y su resultado idempotente se confirman en una sola transacción; una caída posterior del correo no vuelve a ejecutar el cambio.</w:t>
       </w:r>
     </w:p>
     <w:p>
@@ -4267,7 +4377,7 @@
         <w:spacing w:after="60"/>
       </w:pPr>
       <w:r>
-        <w:t>El servicio responde ERROR - Orden no procesada ante sintaxis inválida, permisos insuficientes, parámetros incorrectos o fallos de persistencia.</w:t>
+        <w:t>El servicio valida roles, sintaxis, cantidad y tamaño de parámetros; limita cada ciclo a 25 mensajes y cada listado a 200 filas.</w:t>
       </w:r>
     </w:p>
     <w:p>
@@ -4276,7 +4386,7 @@
         <w:spacing w:after="60"/>
       </w:pPr>
       <w:r>
-        <w:t>Los identificadores POP3 se consultan en bloque y se comparan con la tabla de mensajes procesados, evitando respuestas duplicadas.</w:t>
+        <w:t>Los cortes de PostgreSQL, POP3 o Roundcube activan tiempos máximos y reintentos progresivos, sin cerrar el servicio.</w:t>
       </w:r>
     </w:p>
     <w:p>
@@ -4285,7 +4395,25 @@
         <w:spacing w:after="60"/>
       </w:pPr>
       <w:r>
-        <w:t>Las respuestas salen por la sesión institucional de Roundcube, porque el SMTP directo no permite retransmisión externa desde una red doméstica.</w:t>
+        <w:t>La cola p1_correo_control separa ejecución y respuesta: si el correo está caído, la respuesta queda pendiente sin repetir el negocio.</w:t>
+      </w:r>
+    </w:p>
+    <w:p>
+      <w:pPr>
+        <w:pStyle w:val="ListBullet"/>
+        <w:spacing w:after="60"/>
+      </w:pPr>
+      <w:r>
+        <w:t>p1_resultado_orden usa el UIDL como clave idempotente. Negocio, auditoría y resultado se confirman o revierten juntos.</w:t>
+      </w:r>
+    </w:p>
+    <w:p>
+      <w:pPr>
+        <w:pStyle w:val="ListBullet"/>
+        <w:spacing w:after="60"/>
+      </w:pPr>
+      <w:r>
+        <w:t>Windows y Linux incluyen scripts de reinicio; Fedora dispone además de una unidad systemd endurecida.</w:t>
       </w:r>
     </w:p>
     <w:p>
@@ -4486,7 +4614,7 @@
                 <w:color w:val="000000"/>
                 <w:sz w:val="17"/>
               </w:rPr>
-              <w:t>Analizador, permisos y validaciones ejecutados sin fallos.</w:t>
+              <w:t>13 pruebas sin fallos: analizador, permisos, límites y reintentos.</w:t>
             </w:r>
           </w:p>
         </w:tc>
@@ -4540,7 +4668,7 @@
                 <w:color w:val="000000"/>
                 <w:sz w:val="17"/>
               </w:rPr>
-              <w:t>Autenticación correcta y esquema p1_ aplicado.</w:t>
+              <w:t>Esquema resiliente p1_ aplicado correctamente.</w:t>
             </w:r>
           </w:p>
         </w:tc>
@@ -4569,7 +4697,117 @@
                 <w:color w:val="000000"/>
                 <w:sz w:val="17"/>
               </w:rPr>
-              <w:t>AYUDA[] desde Gmail</w:t>
+              <w:t>Caída de PostgreSQL</w:t>
+            </w:r>
+          </w:p>
+        </w:tc>
+        <w:tc>
+          <w:tcPr>
+            <w:tcW w:type="dxa" w:w="6408"/>
+            <w:shd w:fill="F4F7FB"/>
+            <w:vAlign w:val="center"/>
+            <w:tcMar>
+              <w:top w:w="90" w:type="dxa"/>
+              <w:left w:w="90" w:type="dxa"/>
+              <w:bottom w:w="90" w:type="dxa"/>
+              <w:right w:w="90" w:type="dxa"/>
+            </w:tcMar>
+          </w:tcPr>
+          <w:p>
+            <w:pPr>
+              <w:jc w:val="left"/>
+            </w:pPr>
+            <w:r/>
+            <w:r>
+              <w:rPr>
+                <w:b w:val="0"/>
+                <w:color w:val="000000"/>
+                <w:sz w:val="17"/>
+              </w:rPr>
+              <w:t>El proceso permaneció activo y aplicó reintentos progresivos.</w:t>
+            </w:r>
+          </w:p>
+        </w:tc>
+      </w:tr>
+      <w:tr>
+        <w:tc>
+          <w:tcPr>
+            <w:tcW w:type="dxa" w:w="3096"/>
+            <w:vAlign w:val="center"/>
+            <w:tcMar>
+              <w:top w:w="90" w:type="dxa"/>
+              <w:left w:w="90" w:type="dxa"/>
+              <w:bottom w:w="90" w:type="dxa"/>
+              <w:right w:w="90" w:type="dxa"/>
+            </w:tcMar>
+          </w:tcPr>
+          <w:p>
+            <w:pPr>
+              <w:jc w:val="center"/>
+            </w:pPr>
+            <w:r/>
+            <w:r>
+              <w:rPr>
+                <w:b w:val="0"/>
+                <w:color w:val="000000"/>
+                <w:sz w:val="17"/>
+              </w:rPr>
+              <w:t>Caída de POP3</w:t>
+            </w:r>
+          </w:p>
+        </w:tc>
+        <w:tc>
+          <w:tcPr>
+            <w:tcW w:type="dxa" w:w="6408"/>
+            <w:vAlign w:val="center"/>
+            <w:tcMar>
+              <w:top w:w="90" w:type="dxa"/>
+              <w:left w:w="90" w:type="dxa"/>
+              <w:bottom w:w="90" w:type="dxa"/>
+              <w:right w:w="90" w:type="dxa"/>
+            </w:tcMar>
+          </w:tcPr>
+          <w:p>
+            <w:pPr>
+              <w:jc w:val="left"/>
+            </w:pPr>
+            <w:r/>
+            <w:r>
+              <w:rPr>
+                <w:b w:val="0"/>
+                <w:color w:val="000000"/>
+                <w:sz w:val="17"/>
+              </w:rPr>
+              <w:t>El proceso permaneció activo y limitó los reintentos.</w:t>
+            </w:r>
+          </w:p>
+        </w:tc>
+      </w:tr>
+      <w:tr>
+        <w:tc>
+          <w:tcPr>
+            <w:tcW w:type="dxa" w:w="3096"/>
+            <w:shd w:fill="F4F7FB"/>
+            <w:vAlign w:val="center"/>
+            <w:tcMar>
+              <w:top w:w="90" w:type="dxa"/>
+              <w:left w:w="90" w:type="dxa"/>
+              <w:bottom w:w="90" w:type="dxa"/>
+              <w:right w:w="90" w:type="dxa"/>
+            </w:tcMar>
+          </w:tcPr>
+          <w:p>
+            <w:pPr>
+              <w:jc w:val="left"/>
+            </w:pPr>
+            <w:r/>
+            <w:r>
+              <w:rPr>
+                <w:b w:val="0"/>
+                <w:color w:val="000000"/>
+                <w:sz w:val="17"/>
+              </w:rPr>
+              <w:t>Catálogo desde Gmail</w:t>
             </w:r>
           </w:p>
         </w:tc>
@@ -4679,7 +4917,7 @@
                 <w:color w:val="000000"/>
                 <w:sz w:val="17"/>
               </w:rPr>
-              <w:t>Identidad de salida</w:t>
+              <w:t>Clasificación Gmail</w:t>
             </w:r>
           </w:p>
         </w:tc>
@@ -4687,60 +4925,6 @@
           <w:tcPr>
             <w:tcW w:type="dxa" w:w="6408"/>
             <w:shd w:fill="F4F7FB"/>
-            <w:vAlign w:val="center"/>
-            <w:tcMar>
-              <w:top w:w="90" w:type="dxa"/>
-              <w:left w:w="90" w:type="dxa"/>
-              <w:bottom w:w="90" w:type="dxa"/>
-              <w:right w:w="90" w:type="dxa"/>
-            </w:tcMar>
-          </w:tcPr>
-          <w:p>
-            <w:pPr>
-              <w:jc w:val="left"/>
-            </w:pPr>
-            <w:r/>
-            <w:r>
-              <w:rPr>
-                <w:b w:val="0"/>
-                <w:color w:val="000000"/>
-                <w:sz w:val="17"/>
-              </w:rPr>
-              <w:t>Grupo 09 SA &lt;grupo09sa@tecnoweb.org.bo&gt;.</w:t>
-            </w:r>
-          </w:p>
-        </w:tc>
-      </w:tr>
-      <w:tr>
-        <w:tc>
-          <w:tcPr>
-            <w:tcW w:type="dxa" w:w="3096"/>
-            <w:vAlign w:val="center"/>
-            <w:tcMar>
-              <w:top w:w="90" w:type="dxa"/>
-              <w:left w:w="90" w:type="dxa"/>
-              <w:bottom w:w="90" w:type="dxa"/>
-              <w:right w:w="90" w:type="dxa"/>
-            </w:tcMar>
-          </w:tcPr>
-          <w:p>
-            <w:pPr>
-              <w:jc w:val="left"/>
-            </w:pPr>
-            <w:r/>
-            <w:r>
-              <w:rPr>
-                <w:b w:val="0"/>
-                <w:color w:val="000000"/>
-                <w:sz w:val="17"/>
-              </w:rPr>
-              <w:t>Clasificación Gmail</w:t>
-            </w:r>
-          </w:p>
-        </w:tc>
-        <w:tc>
-          <w:tcPr>
-            <w:tcW w:type="dxa" w:w="6408"/>
             <w:vAlign w:val="center"/>
             <w:tcMar>
               <w:top w:w="90" w:type="dxa"/>
@@ -5086,7 +5270,7 @@
                 <w:color w:val="000000"/>
                 <w:sz w:val="17"/>
               </w:rPr>
-              <w:t>Iniciar java -jar target/inf513-proyecto1-1.0.0.jar.</w:t>
+              <w:t>Windows: scripts/run-service.ps1. Linux: scripts/run-service.sh o systemd.</w:t>
             </w:r>
           </w:p>
         </w:tc>
@@ -5140,7 +5324,7 @@
                 <w:color w:val="000000"/>
                 <w:sz w:val="17"/>
               </w:rPr>
-              <w:t>Enviar AYUDA[] al correo del grupo y revisar también Spam en la primera respuesta.</w:t>
+              <w:t>Solicitar el catálogo de ayuda y revisar también Spam.</w:t>
             </w:r>
           </w:p>
         </w:tc>
@@ -5394,7 +5578,7 @@
                 <w:color w:val="000000"/>
                 <w:sz w:val="17"/>
               </w:rPr>
-              <w:t>Arranque del servicio Java y AYUDA[].</w:t>
+              <w:t>Arranque del servicio Java y catálogo de ayuda.</w:t>
             </w:r>
           </w:p>
         </w:tc>
@@ -5585,7 +5769,7 @@
         <w:spacing w:after="120" w:line="259" w:lineRule="auto"/>
       </w:pPr>
       <w:r>
-        <w:t>Cumplimos el flujo solicitado por el docente: una orden enviada en el asunto se procesa automáticamente, afecta o consulta PostgreSQL y genera una respuesta al remitente. La implementación mantiene separados los datos del proyecto, valida la entrada antes de ejecutar SQL y registra los mensajes atendidos para evitar duplicados.</w:t>
+        <w:t>Cumplimos el flujo solicitado por el docente: una orden enviada en el asunto se procesa automáticamente, afecta o consulta PostgreSQL y genera una respuesta al remitente. La implementación mantiene separados los datos, valida la entrada y conserva una cola transaccional para recuperarse de cortes sin repetir operaciones.</w:t>
       </w:r>
     </w:p>
     <w:p>

</xml_diff>

<commit_message>
Endurecer transporte HTTPS y pruebas de resiliencia
</commit_message>
<xml_diff>
--- a/entrega/PUDS_INF513_P1_Grupo09SA.docx
+++ b/entrega/PUDS_INF513_P1_Grupo09SA.docx
@@ -525,7 +525,7 @@
         <w:spacing w:after="60"/>
       </w:pPr>
       <w:r>
-        <w:t>Evitar el reprocesamiento de mensajes mediante identificadores POP3 persistidos.</w:t>
+        <w:t>Evitar el reprocesamiento mediante identificadores persistentes obtenidos por Roundcube HTTPS.</w:t>
       </w:r>
     </w:p>
     <w:p>
@@ -771,7 +771,7 @@
                 <w:color w:val="000000"/>
                 <w:sz w:val="17"/>
               </w:rPr>
-              <w:t>POP3 puerto 110</w:t>
+              <w:t>Roundcube HTTPS</w:t>
             </w:r>
           </w:p>
         </w:tc>
@@ -798,7 +798,7 @@
                 <w:color w:val="000000"/>
                 <w:sz w:val="17"/>
               </w:rPr>
-              <w:t>Obtiene UIDL y descarga solo mensajes nuevos.</w:t>
+              <w:t>Lista la bandeja con identificadores estables y tráfico cifrado.</w:t>
             </w:r>
           </w:p>
         </w:tc>
@@ -4386,7 +4386,16 @@
         <w:spacing w:after="60"/>
       </w:pPr>
       <w:r>
-        <w:t>Los cortes de PostgreSQL, POP3 o Roundcube activan tiempos máximos y reintentos progresivos, sin cerrar el servicio.</w:t>
+        <w:t>Roundcube HTTPS cifra autenticación, lectura y respuesta; POP3 sin TLS queda solo como respaldo manual.</w:t>
+      </w:r>
+    </w:p>
+    <w:p>
+      <w:pPr>
+        <w:pStyle w:val="ListBullet"/>
+        <w:spacing w:after="60"/>
+      </w:pPr>
+      <w:r>
+        <w:t>Los cortes de PostgreSQL, Internet o Roundcube activan tiempos máximos y reintentos progresivos, sin cerrar el servicio.</w:t>
       </w:r>
     </w:p>
     <w:p>
@@ -4404,7 +4413,7 @@
         <w:spacing w:after="60"/>
       </w:pPr>
       <w:r>
-        <w:t>p1_resultado_orden usa el UIDL como clave idempotente. Negocio, auditoría y resultado se confirman o revierten juntos.</w:t>
+        <w:t>p1_resultado_orden usa el identificador del mensaje como clave idempotente. Negocio, auditoría y resultado se confirman o revierten juntos.</w:t>
       </w:r>
     </w:p>
     <w:p>
@@ -4578,7 +4587,7 @@
           </w:tcPr>
           <w:p>
             <w:pPr>
-              <w:jc w:val="center"/>
+              <w:jc w:val="left"/>
             </w:pPr>
             <w:r/>
             <w:r>
@@ -4587,7 +4596,7 @@
                 <w:color w:val="000000"/>
                 <w:sz w:val="17"/>
               </w:rPr>
-              <w:t>Pruebas unitarias</w:t>
+              <w:t>Pruebas automatizadas</w:t>
             </w:r>
           </w:p>
         </w:tc>
@@ -4614,7 +4623,7 @@
                 <w:color w:val="000000"/>
                 <w:sz w:val="17"/>
               </w:rPr>
-              <w:t>13 pruebas sin fallos: analizador, permisos, límites y reintentos.</w:t>
+              <w:t>Analizador, permisos, límites y reintentos sin fallos.</w:t>
             </w:r>
           </w:p>
         </w:tc>
@@ -4642,6 +4651,61 @@
                 <w:color w:val="000000"/>
                 <w:sz w:val="17"/>
               </w:rPr>
+              <w:t>Fuzzing</w:t>
+            </w:r>
+          </w:p>
+        </w:tc>
+        <w:tc>
+          <w:tcPr>
+            <w:tcW w:type="dxa" w:w="6408"/>
+            <w:vAlign w:val="center"/>
+            <w:tcMar>
+              <w:top w:w="90" w:type="dxa"/>
+              <w:left w:w="90" w:type="dxa"/>
+              <w:bottom w:w="90" w:type="dxa"/>
+              <w:right w:w="90" w:type="dxa"/>
+            </w:tcMar>
+          </w:tcPr>
+          <w:p>
+            <w:pPr>
+              <w:jc w:val="left"/>
+            </w:pPr>
+            <w:r/>
+            <w:r>
+              <w:rPr>
+                <w:b w:val="0"/>
+                <w:color w:val="000000"/>
+                <w:sz w:val="17"/>
+              </w:rPr>
+              <w:t>1.000.000 de asuntos aleatorios sin derribar el analizador.</w:t>
+            </w:r>
+          </w:p>
+        </w:tc>
+      </w:tr>
+      <w:tr>
+        <w:tc>
+          <w:tcPr>
+            <w:tcW w:type="dxa" w:w="3096"/>
+            <w:shd w:fill="F4F7FB"/>
+            <w:vAlign w:val="center"/>
+            <w:tcMar>
+              <w:top w:w="90" w:type="dxa"/>
+              <w:left w:w="90" w:type="dxa"/>
+              <w:bottom w:w="90" w:type="dxa"/>
+              <w:right w:w="90" w:type="dxa"/>
+            </w:tcMar>
+          </w:tcPr>
+          <w:p>
+            <w:pPr>
+              <w:jc w:val="center"/>
+            </w:pPr>
+            <w:r/>
+            <w:r>
+              <w:rPr>
+                <w:b w:val="0"/>
+                <w:color w:val="000000"/>
+                <w:sz w:val="17"/>
+              </w:rPr>
               <w:t>PostgreSQL remoto</w:t>
             </w:r>
           </w:p>
@@ -4649,6 +4713,7 @@
         <w:tc>
           <w:tcPr>
             <w:tcW w:type="dxa" w:w="6408"/>
+            <w:shd w:fill="F4F7FB"/>
             <w:vAlign w:val="center"/>
             <w:tcMar>
               <w:top w:w="90" w:type="dxa"/>
@@ -4677,7 +4742,6 @@
         <w:tc>
           <w:tcPr>
             <w:tcW w:type="dxa" w:w="3096"/>
-            <w:shd w:fill="F4F7FB"/>
             <w:vAlign w:val="center"/>
             <w:tcMar>
               <w:top w:w="90" w:type="dxa"/>
@@ -4688,7 +4752,7 @@
           </w:tcPr>
           <w:p>
             <w:pPr>
-              <w:jc w:val="left"/>
+              <w:jc w:val="center"/>
             </w:pPr>
             <w:r/>
             <w:r>
@@ -4697,14 +4761,13 @@
                 <w:color w:val="000000"/>
                 <w:sz w:val="17"/>
               </w:rPr>
-              <w:t>Caída de PostgreSQL</w:t>
+              <w:t>Caída simulada</w:t>
             </w:r>
           </w:p>
         </w:tc>
         <w:tc>
           <w:tcPr>
             <w:tcW w:type="dxa" w:w="6408"/>
-            <w:shd w:fill="F4F7FB"/>
             <w:vAlign w:val="center"/>
             <w:tcMar>
               <w:top w:w="90" w:type="dxa"/>
@@ -4733,6 +4796,7 @@
         <w:tc>
           <w:tcPr>
             <w:tcW w:type="dxa" w:w="3096"/>
+            <w:shd w:fill="F4F7FB"/>
             <w:vAlign w:val="center"/>
             <w:tcMar>
               <w:top w:w="90" w:type="dxa"/>
@@ -4752,7 +4816,62 @@
                 <w:color w:val="000000"/>
                 <w:sz w:val="17"/>
               </w:rPr>
-              <w:t>Caída de POP3</w:t>
+              <w:t>Roundcube HTTPS</w:t>
+            </w:r>
+          </w:p>
+        </w:tc>
+        <w:tc>
+          <w:tcPr>
+            <w:tcW w:type="dxa" w:w="6408"/>
+            <w:shd w:fill="F4F7FB"/>
+            <w:vAlign w:val="center"/>
+            <w:tcMar>
+              <w:top w:w="90" w:type="dxa"/>
+              <w:left w:w="90" w:type="dxa"/>
+              <w:bottom w:w="90" w:type="dxa"/>
+              <w:right w:w="90" w:type="dxa"/>
+            </w:tcMar>
+          </w:tcPr>
+          <w:p>
+            <w:pPr>
+              <w:jc w:val="left"/>
+            </w:pPr>
+            <w:r/>
+            <w:r>
+              <w:rPr>
+                <w:b w:val="0"/>
+                <w:color w:val="000000"/>
+                <w:sz w:val="17"/>
+              </w:rPr>
+              <w:t>Lectura real verificada sobre 149 mensajes sin exponer contenido.</w:t>
+            </w:r>
+          </w:p>
+        </w:tc>
+      </w:tr>
+      <w:tr>
+        <w:tc>
+          <w:tcPr>
+            <w:tcW w:type="dxa" w:w="3096"/>
+            <w:vAlign w:val="center"/>
+            <w:tcMar>
+              <w:top w:w="90" w:type="dxa"/>
+              <w:left w:w="90" w:type="dxa"/>
+              <w:bottom w:w="90" w:type="dxa"/>
+              <w:right w:w="90" w:type="dxa"/>
+            </w:tcMar>
+          </w:tcPr>
+          <w:p>
+            <w:pPr>
+              <w:jc w:val="left"/>
+            </w:pPr>
+            <w:r/>
+            <w:r>
+              <w:rPr>
+                <w:b w:val="0"/>
+                <w:color w:val="000000"/>
+                <w:sz w:val="17"/>
+              </w:rPr>
+              <w:t>Catálogo desde Gmail</w:t>
             </w:r>
           </w:p>
         </w:tc>
@@ -4778,7 +4897,7 @@
                 <w:color w:val="000000"/>
                 <w:sz w:val="17"/>
               </w:rPr>
-              <w:t>El proceso permaneció activo y limitó los reintentos.</w:t>
+              <w:t>Procesado y respondido con el catálogo de órdenes.</w:t>
             </w:r>
           </w:p>
         </w:tc>
@@ -4807,7 +4926,7 @@
                 <w:color w:val="000000"/>
                 <w:sz w:val="17"/>
               </w:rPr>
-              <w:t>Catálogo desde Gmail</w:t>
+              <w:t>LISCON["*"] desde Gmail</w:t>
             </w:r>
           </w:p>
         </w:tc>
@@ -4834,117 +4953,7 @@
                 <w:color w:val="000000"/>
                 <w:sz w:val="17"/>
               </w:rPr>
-              <w:t>Procesado y respondido con el catálogo de órdenes.</w:t>
-            </w:r>
-          </w:p>
-        </w:tc>
-      </w:tr>
-      <w:tr>
-        <w:tc>
-          <w:tcPr>
-            <w:tcW w:type="dxa" w:w="3096"/>
-            <w:vAlign w:val="center"/>
-            <w:tcMar>
-              <w:top w:w="90" w:type="dxa"/>
-              <w:left w:w="90" w:type="dxa"/>
-              <w:bottom w:w="90" w:type="dxa"/>
-              <w:right w:w="90" w:type="dxa"/>
-            </w:tcMar>
-          </w:tcPr>
-          <w:p>
-            <w:pPr>
-              <w:jc w:val="left"/>
-            </w:pPr>
-            <w:r/>
-            <w:r>
-              <w:rPr>
-                <w:b w:val="0"/>
-                <w:color w:val="000000"/>
-                <w:sz w:val="17"/>
-              </w:rPr>
-              <w:t>LISCON["*"] desde Gmail</w:t>
-            </w:r>
-          </w:p>
-        </w:tc>
-        <w:tc>
-          <w:tcPr>
-            <w:tcW w:type="dxa" w:w="6408"/>
-            <w:vAlign w:val="center"/>
-            <w:tcMar>
-              <w:top w:w="90" w:type="dxa"/>
-              <w:left w:w="90" w:type="dxa"/>
-              <w:bottom w:w="90" w:type="dxa"/>
-              <w:right w:w="90" w:type="dxa"/>
-            </w:tcMar>
-          </w:tcPr>
-          <w:p>
-            <w:pPr>
-              <w:jc w:val="left"/>
-            </w:pPr>
-            <w:r/>
-            <w:r>
-              <w:rPr>
-                <w:b w:val="0"/>
-                <w:color w:val="000000"/>
-                <w:sz w:val="17"/>
-              </w:rPr>
               <w:t>Consulta SQL ejecutada; respuesta: Sin resultados.</w:t>
-            </w:r>
-          </w:p>
-        </w:tc>
-      </w:tr>
-      <w:tr>
-        <w:tc>
-          <w:tcPr>
-            <w:tcW w:type="dxa" w:w="3096"/>
-            <w:shd w:fill="F4F7FB"/>
-            <w:vAlign w:val="center"/>
-            <w:tcMar>
-              <w:top w:w="90" w:type="dxa"/>
-              <w:left w:w="90" w:type="dxa"/>
-              <w:bottom w:w="90" w:type="dxa"/>
-              <w:right w:w="90" w:type="dxa"/>
-            </w:tcMar>
-          </w:tcPr>
-          <w:p>
-            <w:pPr>
-              <w:jc w:val="left"/>
-            </w:pPr>
-            <w:r/>
-            <w:r>
-              <w:rPr>
-                <w:b w:val="0"/>
-                <w:color w:val="000000"/>
-                <w:sz w:val="17"/>
-              </w:rPr>
-              <w:t>Clasificación Gmail</w:t>
-            </w:r>
-          </w:p>
-        </w:tc>
-        <w:tc>
-          <w:tcPr>
-            <w:tcW w:type="dxa" w:w="6408"/>
-            <w:shd w:fill="F4F7FB"/>
-            <w:vAlign w:val="center"/>
-            <w:tcMar>
-              <w:top w:w="90" w:type="dxa"/>
-              <w:left w:w="90" w:type="dxa"/>
-              <w:bottom w:w="90" w:type="dxa"/>
-              <w:right w:w="90" w:type="dxa"/>
-            </w:tcMar>
-          </w:tcPr>
-          <w:p>
-            <w:pPr>
-              <w:jc w:val="left"/>
-            </w:pPr>
-            <w:r/>
-            <w:r>
-              <w:rPr>
-                <w:b w:val="0"/>
-                <w:color w:val="000000"/>
-                <w:sz w:val="17"/>
-              </w:rPr>
-              <w:t>La respuesta llegó a Spam; no es un fallo de entrega.</w:t>
             </w:r>
           </w:p>
         </w:tc>

</xml_diff>

<commit_message>
Cerrar casos límite y reforzar integridad
</commit_message>
<xml_diff>
--- a/entrega/PUDS_INF513_P1_Grupo09SA.docx
+++ b/entrega/PUDS_INF513_P1_Grupo09SA.docx
@@ -3540,7 +3540,7 @@
         <w:spacing w:after="60"/>
       </w:pPr>
       <w:r>
-        <w:t>Los identificadores deben ser enteros positivos; las plazas aceptan cero o un número positivo.</w:t>
+        <w:t>Los identificadores deben ser enteros positivos; las plazas aceptan cero o un número positivo. Letras, NaN, infinitos y desbordamientos se rechazan.</w:t>
       </w:r>
     </w:p>
     <w:p>
@@ -3549,7 +3549,16 @@
         <w:spacing w:after="60"/>
       </w:pPr>
       <w:r>
-        <w:t>Los puntajes se limitan al intervalo de 0 a 100.</w:t>
+        <w:t>Los puntajes se limitan al intervalo de 0 a 100 con máximo dos decimales. PostgreSQL repite esta comprobación mediante restricciones CHECK.</w:t>
+      </w:r>
+    </w:p>
+    <w:p>
+      <w:pPr>
+        <w:pStyle w:val="ListBullet"/>
+        <w:spacing w:after="60"/>
+      </w:pPr>
+      <w:r>
+        <w:t>Los textos respetan el tamaño de cada columna y no admiten controles, saltos de línea ni espacios accidentales en los extremos.</w:t>
       </w:r>
     </w:p>
     <w:p>
@@ -4377,7 +4386,16 @@
         <w:spacing w:after="60"/>
       </w:pPr>
       <w:r>
-        <w:t>El servicio valida roles, sintaxis, cantidad y tamaño de parámetros; limita cada ciclo a 25 mensajes y cada listado a 200 filas.</w:t>
+        <w:t>El servicio valida roles, sintaxis, tipo, rango, fechas, estados y tamaño antes de ejecutar SQL; PostgreSQL conserva restricciones defensivas equivalentes.</w:t>
+      </w:r>
+    </w:p>
+    <w:p>
+      <w:pPr>
+        <w:pStyle w:val="ListBullet"/>
+        <w:spacing w:after="60"/>
+      </w:pPr>
+      <w:r>
+        <w:t>Cada ciclo procesa como máximo 25 mensajes. Los listados se limitan a 200 filas y 50.000 caracteres.</w:t>
       </w:r>
     </w:p>
     <w:p>
@@ -4414,6 +4432,15 @@
       </w:pPr>
       <w:r>
         <w:t>p1_resultado_orden usa el identificador del mensaje como clave idempotente. Negocio, auditoría y resultado se confirman o revierten juntos.</w:t>
+      </w:r>
+    </w:p>
+    <w:p>
+      <w:pPr>
+        <w:pStyle w:val="ListBullet"/>
+        <w:spacing w:after="60"/>
+      </w:pPr>
+      <w:r>
+        <w:t>Un bloqueo asesor de PostgreSQL impide que dos instancias procesen la misma bandeja simultáneamente.</w:t>
       </w:r>
     </w:p>
     <w:p>
@@ -4623,7 +4650,7 @@
                 <w:color w:val="000000"/>
                 <w:sz w:val="17"/>
               </w:rPr>
-              <w:t>Analizador, permisos, límites y reintentos sin fallos.</w:t>
+              <w:t>18 pruebas de analizador, permisos, tipos, límites y reintentos sin fallos.</w:t>
             </w:r>
           </w:p>
         </w:tc>
@@ -4733,7 +4760,7 @@
                 <w:color w:val="000000"/>
                 <w:sz w:val="17"/>
               </w:rPr>
-              <w:t>Esquema resiliente p1_ aplicado correctamente.</w:t>
+              <w:t>Esquema resiliente p1_ y restricciones CHECK aplicados correctamente.</w:t>
             </w:r>
           </w:p>
         </w:tc>

</xml_diff>

<commit_message>
Acotar recursos y ampliar pruebas de estrés
</commit_message>
<xml_diff>
--- a/entrega/PUDS_INF513_P1_Grupo09SA.docx
+++ b/entrega/PUDS_INF513_P1_Grupo09SA.docx
@@ -4650,7 +4650,7 @@
                 <w:color w:val="000000"/>
                 <w:sz w:val="17"/>
               </w:rPr>
-              <w:t>18 pruebas de analizador, permisos, tipos, límites y reintentos sin fallos.</w:t>
+              <w:t>22 pruebas de analizador, permisos, configuración, límites y reintentos sin fallos.</w:t>
             </w:r>
           </w:p>
         </w:tc>
@@ -4704,7 +4704,7 @@
                 <w:color w:val="000000"/>
                 <w:sz w:val="17"/>
               </w:rPr>
-              <w:t>1.000.000 de asuntos aleatorios sin derribar el analizador.</w:t>
+              <w:t>10.000.000 de asuntos aleatorios sin derribar el analizador.</w:t>
             </w:r>
           </w:p>
         </w:tc>
@@ -4733,6 +4733,61 @@
                 <w:color w:val="000000"/>
                 <w:sz w:val="17"/>
               </w:rPr>
+              <w:t>Concurrencia</w:t>
+            </w:r>
+          </w:p>
+        </w:tc>
+        <w:tc>
+          <w:tcPr>
+            <w:tcW w:type="dxa" w:w="6408"/>
+            <w:shd w:fill="F4F7FB"/>
+            <w:vAlign w:val="center"/>
+            <w:tcMar>
+              <w:top w:w="90" w:type="dxa"/>
+              <w:left w:w="90" w:type="dxa"/>
+              <w:bottom w:w="90" w:type="dxa"/>
+              <w:right w:w="90" w:type="dxa"/>
+            </w:tcMar>
+          </w:tcPr>
+          <w:p>
+            <w:pPr>
+              <w:jc w:val="left"/>
+            </w:pPr>
+            <w:r/>
+            <w:r>
+              <w:rPr>
+                <w:b w:val="0"/>
+                <w:color w:val="000000"/>
+                <w:sz w:val="17"/>
+              </w:rPr>
+              <w:t>320.000 análisis en 32 hilos sin errores.</w:t>
+            </w:r>
+          </w:p>
+        </w:tc>
+      </w:tr>
+      <w:tr>
+        <w:tc>
+          <w:tcPr>
+            <w:tcW w:type="dxa" w:w="3096"/>
+            <w:vAlign w:val="center"/>
+            <w:tcMar>
+              <w:top w:w="90" w:type="dxa"/>
+              <w:left w:w="90" w:type="dxa"/>
+              <w:bottom w:w="90" w:type="dxa"/>
+              <w:right w:w="90" w:type="dxa"/>
+            </w:tcMar>
+          </w:tcPr>
+          <w:p>
+            <w:pPr>
+              <w:jc w:val="center"/>
+            </w:pPr>
+            <w:r/>
+            <w:r>
+              <w:rPr>
+                <w:b w:val="0"/>
+                <w:color w:val="000000"/>
+                <w:sz w:val="17"/>
+              </w:rPr>
               <w:t>PostgreSQL remoto</w:t>
             </w:r>
           </w:p>
@@ -4740,7 +4795,6 @@
         <w:tc>
           <w:tcPr>
             <w:tcW w:type="dxa" w:w="6408"/>
-            <w:shd w:fill="F4F7FB"/>
             <w:vAlign w:val="center"/>
             <w:tcMar>
               <w:top w:w="90" w:type="dxa"/>
@@ -4769,6 +4823,7 @@
         <w:tc>
           <w:tcPr>
             <w:tcW w:type="dxa" w:w="3096"/>
+            <w:shd w:fill="F4F7FB"/>
             <w:vAlign w:val="center"/>
             <w:tcMar>
               <w:top w:w="90" w:type="dxa"/>
@@ -4795,6 +4850,7 @@
         <w:tc>
           <w:tcPr>
             <w:tcW w:type="dxa" w:w="6408"/>
+            <w:shd w:fill="F4F7FB"/>
             <w:vAlign w:val="center"/>
             <w:tcMar>
               <w:top w:w="90" w:type="dxa"/>
@@ -4823,7 +4879,6 @@
         <w:tc>
           <w:tcPr>
             <w:tcW w:type="dxa" w:w="3096"/>
-            <w:shd w:fill="F4F7FB"/>
             <w:vAlign w:val="center"/>
             <w:tcMar>
               <w:top w:w="90" w:type="dxa"/>
@@ -4850,7 +4905,6 @@
         <w:tc>
           <w:tcPr>
             <w:tcW w:type="dxa" w:w="6408"/>
-            <w:shd w:fill="F4F7FB"/>
             <w:vAlign w:val="center"/>
             <w:tcMar>
               <w:top w:w="90" w:type="dxa"/>
@@ -4879,6 +4933,7 @@
         <w:tc>
           <w:tcPr>
             <w:tcW w:type="dxa" w:w="3096"/>
+            <w:shd w:fill="F4F7FB"/>
             <w:vAlign w:val="center"/>
             <w:tcMar>
               <w:top w:w="90" w:type="dxa"/>
@@ -4905,6 +4960,7 @@
         <w:tc>
           <w:tcPr>
             <w:tcW w:type="dxa" w:w="6408"/>
+            <w:shd w:fill="F4F7FB"/>
             <w:vAlign w:val="center"/>
             <w:tcMar>
               <w:top w:w="90" w:type="dxa"/>
@@ -4933,7 +4989,6 @@
         <w:tc>
           <w:tcPr>
             <w:tcW w:type="dxa" w:w="3096"/>
-            <w:shd w:fill="F4F7FB"/>
             <w:vAlign w:val="center"/>
             <w:tcMar>
               <w:top w:w="90" w:type="dxa"/>
@@ -4960,7 +5015,6 @@
         <w:tc>
           <w:tcPr>
             <w:tcW w:type="dxa" w:w="6408"/>
-            <w:shd w:fill="F4F7FB"/>
             <w:vAlign w:val="center"/>
             <w:tcMar>
               <w:top w:w="90" w:type="dxa"/>

</xml_diff>

<commit_message>
Hardening integral de seguridad y reglas de negocio
</commit_message>
<xml_diff>
--- a/entrega/PUDS_INF513_P1_Grupo09SA.docx
+++ b/entrega/PUDS_INF513_P1_Grupo09SA.docx
@@ -4395,7 +4395,16 @@
         <w:spacing w:after="60"/>
       </w:pPr>
       <w:r>
-        <w:t>Cada ciclo procesa como máximo 25 mensajes. Los listados se limitan a 200 filas y 50.000 caracteres.</w:t>
+        <w:t>La creación del primer DECANO exige que remitente, nuevo correo y BOOTSTRAP_ADMIN_EMAIL coincidan.</w:t>
+      </w:r>
+    </w:p>
+    <w:p>
+      <w:pPr>
+        <w:pStyle w:val="ListBullet"/>
+        <w:spacing w:after="60"/>
+      </w:pPr>
+      <w:r>
+        <w:t>Cada ciclo procesa como máximo 25 mensajes. Los IDs históricos se consultan por lotes y no se cargan todos en memoria.</w:t>
       </w:r>
     </w:p>
     <w:p>
@@ -4650,7 +4659,7 @@
                 <w:color w:val="000000"/>
                 <w:sz w:val="17"/>
               </w:rPr>
-              <w:t>22 pruebas de analizador, permisos, configuración, límites y reintentos sin fallos.</w:t>
+              <w:t>25 pruebas de analizador, permisos, bootstrap, configuración, límites y reintentos sin fallos.</w:t>
             </w:r>
           </w:p>
         </w:tc>
@@ -4944,7 +4953,7 @@
           </w:tcPr>
           <w:p>
             <w:pPr>
-              <w:jc w:val="left"/>
+              <w:jc w:val="center"/>
             </w:pPr>
             <w:r/>
             <w:r>
@@ -4953,7 +4962,7 @@
                 <w:color w:val="000000"/>
                 <w:sz w:val="17"/>
               </w:rPr>
-              <w:t>Catálogo desde Gmail</w:t>
+              <w:t>Filtro real</w:t>
             </w:r>
           </w:p>
         </w:tc>
@@ -4980,7 +4989,7 @@
                 <w:color w:val="000000"/>
                 <w:sz w:val="17"/>
               </w:rPr>
-              <w:t>Procesado y respondido con el catálogo de órdenes.</w:t>
+              <w:t>LISCON["C"] ejecutó SQL parametrizado y respondió: Sin resultados.</w:t>
             </w:r>
           </w:p>
         </w:tc>
@@ -4999,7 +5008,7 @@
           </w:tcPr>
           <w:p>
             <w:pPr>
-              <w:jc w:val="left"/>
+              <w:jc w:val="center"/>
             </w:pPr>
             <w:r/>
             <w:r>
@@ -5008,7 +5017,7 @@
                 <w:color w:val="000000"/>
                 <w:sz w:val="17"/>
               </w:rPr>
-              <w:t>LISCON["*"] desde Gmail</w:t>
+              <w:t>Dependencias</w:t>
             </w:r>
           </w:p>
         </w:tc>
@@ -5034,7 +5043,7 @@
                 <w:color w:val="000000"/>
                 <w:sz w:val="17"/>
               </w:rPr>
-              <w:t>Consulta SQL ejecutada; respuesta: Sin resultados.</w:t>
+              <w:t>Jackson 2.22.3, JDBC 42.7.14 y HttpClient 5.6.</w:t>
             </w:r>
           </w:p>
         </w:tc>

</xml_diff>

<commit_message>
Finalize delivery and test mail-cycle recovery and transient database failures
</commit_message>
<xml_diff>
--- a/entrega/PUDS_INF513_P1_Grupo09SA.docx
+++ b/entrega/PUDS_INF513_P1_Grupo09SA.docx
@@ -98,6 +98,7 @@
       <w:tr>
         <w:trPr>
           <w:tblHeader/>
+          <w:cantSplit/>
         </w:trPr>
         <w:tc>
           <w:tcPr>
@@ -197,6 +198,9 @@
         </w:tc>
       </w:tr>
       <w:tr>
+        <w:trPr>
+          <w:cantSplit/>
+        </w:trPr>
         <w:tc>
           <w:tcPr>
             <w:tcW w:type="dxa" w:w="3312"/>
@@ -289,6 +293,9 @@
         </w:tc>
       </w:tr>
       <w:tr>
+        <w:trPr>
+          <w:cantSplit/>
+        </w:trPr>
         <w:tc>
           <w:tcPr>
             <w:tcW w:type="dxa" w:w="3312"/>
@@ -384,6 +391,9 @@
         </w:tc>
       </w:tr>
       <w:tr>
+        <w:trPr>
+          <w:cantSplit/>
+        </w:trPr>
         <w:tc>
           <w:tcPr>
             <w:tcW w:type="dxa" w:w="3312"/>
@@ -614,6 +624,7 @@
       <w:tr>
         <w:trPr>
           <w:tblHeader/>
+          <w:cantSplit/>
         </w:trPr>
         <w:tc>
           <w:tcPr>
@@ -713,6 +724,9 @@
         </w:tc>
       </w:tr>
       <w:tr>
+        <w:trPr>
+          <w:cantSplit/>
+        </w:trPr>
         <w:tc>
           <w:tcPr>
             <w:tcW w:type="dxa" w:w="3312"/>
@@ -805,6 +819,9 @@
         </w:tc>
       </w:tr>
       <w:tr>
+        <w:trPr>
+          <w:cantSplit/>
+        </w:trPr>
         <w:tc>
           <w:tcPr>
             <w:tcW w:type="dxa" w:w="3312"/>
@@ -900,6 +917,9 @@
         </w:tc>
       </w:tr>
       <w:tr>
+        <w:trPr>
+          <w:cantSplit/>
+        </w:trPr>
         <w:tc>
           <w:tcPr>
             <w:tcW w:type="dxa" w:w="3312"/>
@@ -992,6 +1012,9 @@
         </w:tc>
       </w:tr>
       <w:tr>
+        <w:trPr>
+          <w:cantSplit/>
+        </w:trPr>
         <w:tc>
           <w:tcPr>
             <w:tcW w:type="dxa" w:w="3312"/>
@@ -1087,6 +1110,9 @@
         </w:tc>
       </w:tr>
       <w:tr>
+        <w:trPr>
+          <w:cantSplit/>
+        </w:trPr>
         <w:tc>
           <w:tcPr>
             <w:tcW w:type="dxa" w:w="3312"/>
@@ -1179,6 +1205,9 @@
         </w:tc>
       </w:tr>
       <w:tr>
+        <w:trPr>
+          <w:cantSplit/>
+        </w:trPr>
         <w:tc>
           <w:tcPr>
             <w:tcW w:type="dxa" w:w="3312"/>
@@ -1319,6 +1348,7 @@
       <w:tr>
         <w:trPr>
           <w:tblHeader/>
+          <w:cantSplit/>
         </w:trPr>
         <w:tc>
           <w:tcPr>
@@ -1418,6 +1448,9 @@
         </w:tc>
       </w:tr>
       <w:tr>
+        <w:trPr>
+          <w:cantSplit/>
+        </w:trPr>
         <w:tc>
           <w:tcPr>
             <w:tcW w:type="dxa" w:w="3312"/>
@@ -1510,6 +1543,9 @@
         </w:tc>
       </w:tr>
       <w:tr>
+        <w:trPr>
+          <w:cantSplit/>
+        </w:trPr>
         <w:tc>
           <w:tcPr>
             <w:tcW w:type="dxa" w:w="3312"/>
@@ -1605,6 +1641,9 @@
         </w:tc>
       </w:tr>
       <w:tr>
+        <w:trPr>
+          <w:cantSplit/>
+        </w:trPr>
         <w:tc>
           <w:tcPr>
             <w:tcW w:type="dxa" w:w="3312"/>
@@ -1697,6 +1736,9 @@
         </w:tc>
       </w:tr>
       <w:tr>
+        <w:trPr>
+          <w:cantSplit/>
+        </w:trPr>
         <w:tc>
           <w:tcPr>
             <w:tcW w:type="dxa" w:w="3312"/>
@@ -1792,6 +1834,9 @@
         </w:tc>
       </w:tr>
       <w:tr>
+        <w:trPr>
+          <w:cantSplit/>
+        </w:trPr>
         <w:tc>
           <w:tcPr>
             <w:tcW w:type="dxa" w:w="3312"/>
@@ -1884,6 +1929,9 @@
         </w:tc>
       </w:tr>
       <w:tr>
+        <w:trPr>
+          <w:cantSplit/>
+        </w:trPr>
         <w:tc>
           <w:tcPr>
             <w:tcW w:type="dxa" w:w="3312"/>
@@ -1979,6 +2027,9 @@
         </w:tc>
       </w:tr>
       <w:tr>
+        <w:trPr>
+          <w:cantSplit/>
+        </w:trPr>
         <w:tc>
           <w:tcPr>
             <w:tcW w:type="dxa" w:w="3312"/>
@@ -2071,6 +2122,9 @@
         </w:tc>
       </w:tr>
       <w:tr>
+        <w:trPr>
+          <w:cantSplit/>
+        </w:trPr>
         <w:tc>
           <w:tcPr>
             <w:tcW w:type="dxa" w:w="3312"/>
@@ -2203,6 +2257,7 @@
       <w:tr>
         <w:trPr>
           <w:tblHeader/>
+          <w:cantSplit/>
         </w:trPr>
         <w:tc>
           <w:tcPr>
@@ -2302,6 +2357,9 @@
         </w:tc>
       </w:tr>
       <w:tr>
+        <w:trPr>
+          <w:cantSplit/>
+        </w:trPr>
         <w:tc>
           <w:tcPr>
             <w:tcW w:type="dxa" w:w="1681"/>
@@ -2394,6 +2452,9 @@
         </w:tc>
       </w:tr>
       <w:tr>
+        <w:trPr>
+          <w:cantSplit/>
+        </w:trPr>
         <w:tc>
           <w:tcPr>
             <w:tcW w:type="dxa" w:w="1681"/>
@@ -2489,6 +2550,9 @@
         </w:tc>
       </w:tr>
       <w:tr>
+        <w:trPr>
+          <w:cantSplit/>
+        </w:trPr>
         <w:tc>
           <w:tcPr>
             <w:tcW w:type="dxa" w:w="1681"/>
@@ -2581,6 +2645,9 @@
         </w:tc>
       </w:tr>
       <w:tr>
+        <w:trPr>
+          <w:cantSplit/>
+        </w:trPr>
         <w:tc>
           <w:tcPr>
             <w:tcW w:type="dxa" w:w="1681"/>
@@ -2676,6 +2743,9 @@
         </w:tc>
       </w:tr>
       <w:tr>
+        <w:trPr>
+          <w:cantSplit/>
+        </w:trPr>
         <w:tc>
           <w:tcPr>
             <w:tcW w:type="dxa" w:w="1681"/>
@@ -2768,6 +2838,9 @@
         </w:tc>
       </w:tr>
       <w:tr>
+        <w:trPr>
+          <w:cantSplit/>
+        </w:trPr>
         <w:tc>
           <w:tcPr>
             <w:tcW w:type="dxa" w:w="1681"/>
@@ -2863,6 +2936,9 @@
         </w:tc>
       </w:tr>
       <w:tr>
+        <w:trPr>
+          <w:cantSplit/>
+        </w:trPr>
         <w:tc>
           <w:tcPr>
             <w:tcW w:type="dxa" w:w="1681"/>
@@ -2955,6 +3031,9 @@
         </w:tc>
       </w:tr>
       <w:tr>
+        <w:trPr>
+          <w:cantSplit/>
+        </w:trPr>
         <w:tc>
           <w:tcPr>
             <w:tcW w:type="dxa" w:w="1681"/>
@@ -3050,6 +3129,9 @@
         </w:tc>
       </w:tr>
       <w:tr>
+        <w:trPr>
+          <w:cantSplit/>
+        </w:trPr>
         <w:tc>
           <w:tcPr>
             <w:tcW w:type="dxa" w:w="1681"/>
@@ -3142,6 +3224,9 @@
         </w:tc>
       </w:tr>
       <w:tr>
+        <w:trPr>
+          <w:cantSplit/>
+        </w:trPr>
         <w:tc>
           <w:tcPr>
             <w:tcW w:type="dxa" w:w="1681"/>
@@ -3237,6 +3322,9 @@
         </w:tc>
       </w:tr>
       <w:tr>
+        <w:trPr>
+          <w:cantSplit/>
+        </w:trPr>
         <w:tc>
           <w:tcPr>
             <w:tcW w:type="dxa" w:w="1681"/>
@@ -3329,6 +3417,9 @@
         </w:tc>
       </w:tr>
       <w:tr>
+        <w:trPr>
+          <w:cantSplit/>
+        </w:trPr>
         <w:tc>
           <w:tcPr>
             <w:tcW w:type="dxa" w:w="1681"/>
@@ -3424,6 +3515,9 @@
         </w:tc>
       </w:tr>
       <w:tr>
+        <w:trPr>
+          <w:cantSplit/>
+        </w:trPr>
         <w:tc>
           <w:tcPr>
             <w:tcW w:type="dxa" w:w="1681"/>
@@ -3516,6 +3610,9 @@
         </w:tc>
       </w:tr>
       <w:tr>
+        <w:trPr>
+          <w:cantSplit/>
+        </w:trPr>
         <w:tc>
           <w:tcPr>
             <w:tcW w:type="dxa" w:w="1681"/>
@@ -3611,6 +3708,9 @@
         </w:tc>
       </w:tr>
       <w:tr>
+        <w:trPr>
+          <w:cantSplit/>
+        </w:trPr>
         <w:tc>
           <w:tcPr>
             <w:tcW w:type="dxa" w:w="1681"/>
@@ -3703,6 +3803,9 @@
         </w:tc>
       </w:tr>
       <w:tr>
+        <w:trPr>
+          <w:cantSplit/>
+        </w:trPr>
         <w:tc>
           <w:tcPr>
             <w:tcW w:type="dxa" w:w="1681"/>
@@ -3798,6 +3901,9 @@
         </w:tc>
       </w:tr>
       <w:tr>
+        <w:trPr>
+          <w:cantSplit/>
+        </w:trPr>
         <w:tc>
           <w:tcPr>
             <w:tcW w:type="dxa" w:w="1681"/>
@@ -3890,6 +3996,9 @@
         </w:tc>
       </w:tr>
       <w:tr>
+        <w:trPr>
+          <w:cantSplit/>
+        </w:trPr>
         <w:tc>
           <w:tcPr>
             <w:tcW w:type="dxa" w:w="1681"/>
@@ -3985,6 +4094,9 @@
         </w:tc>
       </w:tr>
       <w:tr>
+        <w:trPr>
+          <w:cantSplit/>
+        </w:trPr>
         <w:tc>
           <w:tcPr>
             <w:tcW w:type="dxa" w:w="1681"/>
@@ -4143,6 +4255,7 @@
       <w:tr>
         <w:trPr>
           <w:tblHeader/>
+          <w:cantSplit/>
         </w:trPr>
         <w:tc>
           <w:tcPr>
@@ -4210,6 +4323,9 @@
         </w:tc>
       </w:tr>
       <w:tr>
+        <w:trPr>
+          <w:cantSplit/>
+        </w:trPr>
         <w:tc>
           <w:tcPr>
             <w:tcW w:type="dxa" w:w="4968"/>
@@ -4272,6 +4388,9 @@
         </w:tc>
       </w:tr>
       <w:tr>
+        <w:trPr>
+          <w:cantSplit/>
+        </w:trPr>
         <w:tc>
           <w:tcPr>
             <w:tcW w:type="dxa" w:w="4968"/>
@@ -4336,6 +4455,9 @@
         </w:tc>
       </w:tr>
       <w:tr>
+        <w:trPr>
+          <w:cantSplit/>
+        </w:trPr>
         <w:tc>
           <w:tcPr>
             <w:tcW w:type="dxa" w:w="4968"/>
@@ -4398,6 +4520,9 @@
         </w:tc>
       </w:tr>
       <w:tr>
+        <w:trPr>
+          <w:cantSplit/>
+        </w:trPr>
         <w:tc>
           <w:tcPr>
             <w:tcW w:type="dxa" w:w="4968"/>
@@ -4462,6 +4587,9 @@
         </w:tc>
       </w:tr>
       <w:tr>
+        <w:trPr>
+          <w:cantSplit/>
+        </w:trPr>
         <w:tc>
           <w:tcPr>
             <w:tcW w:type="dxa" w:w="4968"/>
@@ -4524,6 +4652,9 @@
         </w:tc>
       </w:tr>
       <w:tr>
+        <w:trPr>
+          <w:cantSplit/>
+        </w:trPr>
         <w:tc>
           <w:tcPr>
             <w:tcW w:type="dxa" w:w="4968"/>
@@ -4588,6 +4719,9 @@
         </w:tc>
       </w:tr>
       <w:tr>
+        <w:trPr>
+          <w:cantSplit/>
+        </w:trPr>
         <w:tc>
           <w:tcPr>
             <w:tcW w:type="dxa" w:w="4968"/>
@@ -4650,6 +4784,9 @@
         </w:tc>
       </w:tr>
       <w:tr>
+        <w:trPr>
+          <w:cantSplit/>
+        </w:trPr>
         <w:tc>
           <w:tcPr>
             <w:tcW w:type="dxa" w:w="4968"/>
@@ -4714,6 +4851,9 @@
         </w:tc>
       </w:tr>
       <w:tr>
+        <w:trPr>
+          <w:cantSplit/>
+        </w:trPr>
         <w:tc>
           <w:tcPr>
             <w:tcW w:type="dxa" w:w="4968"/>
@@ -4776,6 +4916,9 @@
         </w:tc>
       </w:tr>
       <w:tr>
+        <w:trPr>
+          <w:cantSplit/>
+        </w:trPr>
         <w:tc>
           <w:tcPr>
             <w:tcW w:type="dxa" w:w="4968"/>
@@ -4840,6 +4983,9 @@
         </w:tc>
       </w:tr>
       <w:tr>
+        <w:trPr>
+          <w:cantSplit/>
+        </w:trPr>
         <w:tc>
           <w:tcPr>
             <w:tcW w:type="dxa" w:w="4968"/>
@@ -4902,6 +5048,9 @@
         </w:tc>
       </w:tr>
       <w:tr>
+        <w:trPr>
+          <w:cantSplit/>
+        </w:trPr>
         <w:tc>
           <w:tcPr>
             <w:tcW w:type="dxa" w:w="4968"/>
@@ -4966,6 +5115,9 @@
         </w:tc>
       </w:tr>
       <w:tr>
+        <w:trPr>
+          <w:cantSplit/>
+        </w:trPr>
         <w:tc>
           <w:tcPr>
             <w:tcW w:type="dxa" w:w="4968"/>
@@ -5098,7 +5250,7 @@
         <w:spacing w:after="60"/>
       </w:pPr>
       <w:r>
-        <w:t>Los cortes de PostgreSQL, Internet o Roundcube activan tiempos máximos y reintentos progresivos, sin cerrar el servicio.</w:t>
+        <w:t>Los cortes de PostgreSQL, Internet o Roundcube activan tiempos máximos y reintentos progresivos. También reintentamos bloqueos temporales y conflictos de serialización de PostgreSQL. La cola conserva las respuestas cuando falla el envío.</w:t>
       </w:r>
     </w:p>
     <w:p>
@@ -5177,6 +5329,7 @@
       <w:tr>
         <w:trPr>
           <w:tblHeader/>
+          <w:cantSplit/>
         </w:trPr>
         <w:tc>
           <w:tcPr>
@@ -5244,6 +5397,9 @@
         </w:tc>
       </w:tr>
       <w:tr>
+        <w:trPr>
+          <w:cantSplit/>
+        </w:trPr>
         <w:tc>
           <w:tcPr>
             <w:tcW w:type="dxa" w:w="4968"/>
@@ -5306,6 +5462,9 @@
         </w:tc>
       </w:tr>
       <w:tr>
+        <w:trPr>
+          <w:cantSplit/>
+        </w:trPr>
         <w:tc>
           <w:tcPr>
             <w:tcW w:type="dxa" w:w="4968"/>
@@ -5354,12 +5513,15 @@
               <w:rPr>
                 <w:sz w:val="18"/>
               </w:rPr>
-              <w:t>44 pruebas con cero fallos, errores y omisiones; incluye PostgreSQL 15 local y el flujo de los ocho casos de uso.</w:t>
+              <w:t>50 pruebas con cero fallos, errores y omisiones; incluye PostgreSQL 15 local y el flujo de los ocho casos de uso.</w:t>
             </w:r>
           </w:p>
         </w:tc>
       </w:tr>
       <w:tr>
+        <w:trPr>
+          <w:cantSplit/>
+        </w:trPr>
         <w:tc>
           <w:tcPr>
             <w:tcW w:type="dxa" w:w="4968"/>
@@ -5422,6 +5584,9 @@
         </w:tc>
       </w:tr>
       <w:tr>
+        <w:trPr>
+          <w:cantSplit/>
+        </w:trPr>
         <w:tc>
           <w:tcPr>
             <w:tcW w:type="dxa" w:w="4968"/>
@@ -5486,6 +5651,9 @@
         </w:tc>
       </w:tr>
       <w:tr>
+        <w:trPr>
+          <w:cantSplit/>
+        </w:trPr>
         <w:tc>
           <w:tcPr>
             <w:tcW w:type="dxa" w:w="4968"/>
@@ -5528,26 +5696,19 @@
             </w:tcMar>
           </w:tcPr>
           <w:p>
-            <w:pPr>
-              <w:jc w:val="left"/>
-            </w:pPr>
-            <w:r>
-              <w:rPr>
-                <w:sz w:val="18"/>
-              </w:rPr>
-            </w:r>
-            <w:r>
-              <w:rPr>
-                <w:b w:val="0"/>
-                <w:color w:val="000000"/>
-                <w:sz w:val="18"/>
-              </w:rPr>
-              <w:t>Esquema resiliente p1_ y restricciones CHECK aplicados correctamente.</w:t>
+            <w:r>
+              <w:rPr>
+                <w:sz w:val="18"/>
+              </w:rPr>
+              <w:t>Comprobación anterior del esquema p1_. Falta migrar esta revisión.</w:t>
             </w:r>
           </w:p>
         </w:tc>
       </w:tr>
       <w:tr>
+        <w:trPr>
+          <w:cantSplit/>
+        </w:trPr>
         <w:tc>
           <w:tcPr>
             <w:tcW w:type="dxa" w:w="4968"/>
@@ -5612,6 +5773,9 @@
         </w:tc>
       </w:tr>
       <w:tr>
+        <w:trPr>
+          <w:cantSplit/>
+        </w:trPr>
         <w:tc>
           <w:tcPr>
             <w:tcW w:type="dxa" w:w="4968"/>
@@ -5674,6 +5838,9 @@
         </w:tc>
       </w:tr>
       <w:tr>
+        <w:trPr>
+          <w:cantSplit/>
+        </w:trPr>
         <w:tc>
           <w:tcPr>
             <w:tcW w:type="dxa" w:w="4968"/>
@@ -5738,6 +5905,9 @@
         </w:tc>
       </w:tr>
       <w:tr>
+        <w:trPr>
+          <w:cantSplit/>
+        </w:trPr>
         <w:tc>
           <w:tcPr>
             <w:tcW w:type="dxa" w:w="4968"/>
@@ -5800,7 +5970,7 @@
         <w:spacing w:after="120" w:line="259" w:lineRule="auto"/>
       </w:pPr>
       <w:r>
-        <w:t>La suite actual comprende 44 pruebas automatizadas en Windows con Java 17 y PostgreSQL 15 aislado, sin fallos ni pruebas omitidas. Incluye el recorrido de los ocho casos de uso con confirmaciones y datos temporales. Las pruebas institucionales por correo registradas previamente corresponden a AYUDA y LISCON. La migración y el arranque de esta revisión en el servidor institucional todavía requieren comprobación con sus credenciales.</w:t>
+        <w:t>La suite actual comprende 50 pruebas automatizadas en Windows con Java 17 y PostgreSQL 15 aislado, sin fallos ni pruebas omitidas. Incluye los ocho casos de uso con confirmaciones y datos temporales, además de fallos simulados de lectura, envío y marcado de correos. Las pruebas institucionales por correo registradas previamente corresponden a AYUDA y LISCON. La migración y el arranque de esta revisión en el servidor institucional todavía requieren comprobación con sus credenciales.</w:t>
       </w:r>
     </w:p>
     <w:p>
@@ -5842,6 +6012,7 @@
       <w:tr>
         <w:trPr>
           <w:tblHeader/>
+          <w:cantSplit/>
         </w:trPr>
         <w:tc>
           <w:tcPr>
@@ -5909,6 +6080,9 @@
         </w:tc>
       </w:tr>
       <w:tr>
+        <w:trPr>
+          <w:cantSplit/>
+        </w:trPr>
         <w:tc>
           <w:tcPr>
             <w:tcW w:type="dxa" w:w="4968"/>
@@ -5971,6 +6145,9 @@
         </w:tc>
       </w:tr>
       <w:tr>
+        <w:trPr>
+          <w:cantSplit/>
+        </w:trPr>
         <w:tc>
           <w:tcPr>
             <w:tcW w:type="dxa" w:w="4968"/>
@@ -6025,6 +6202,9 @@
         </w:tc>
       </w:tr>
       <w:tr>
+        <w:trPr>
+          <w:cantSplit/>
+        </w:trPr>
         <w:tc>
           <w:tcPr>
             <w:tcW w:type="dxa" w:w="4968"/>
@@ -6077,6 +6257,9 @@
         </w:tc>
       </w:tr>
       <w:tr>
+        <w:trPr>
+          <w:cantSplit/>
+        </w:trPr>
         <w:tc>
           <w:tcPr>
             <w:tcW w:type="dxa" w:w="4968"/>
@@ -6141,6 +6324,9 @@
         </w:tc>
       </w:tr>
       <w:tr>
+        <w:trPr>
+          <w:cantSplit/>
+        </w:trPr>
         <w:tc>
           <w:tcPr>
             <w:tcW w:type="dxa" w:w="4968"/>
@@ -6239,6 +6425,7 @@
       <w:tr>
         <w:trPr>
           <w:tblHeader/>
+          <w:cantSplit/>
         </w:trPr>
         <w:tc>
           <w:tcPr>
@@ -6306,6 +6493,9 @@
         </w:tc>
       </w:tr>
       <w:tr>
+        <w:trPr>
+          <w:cantSplit/>
+        </w:trPr>
         <w:tc>
           <w:tcPr>
             <w:tcW w:type="dxa" w:w="4968"/>
@@ -6368,6 +6558,9 @@
         </w:tc>
       </w:tr>
       <w:tr>
+        <w:trPr>
+          <w:cantSplit/>
+        </w:trPr>
         <w:tc>
           <w:tcPr>
             <w:tcW w:type="dxa" w:w="4968"/>
@@ -6432,6 +6625,9 @@
         </w:tc>
       </w:tr>
       <w:tr>
+        <w:trPr>
+          <w:cantSplit/>
+        </w:trPr>
         <w:tc>
           <w:tcPr>
             <w:tcW w:type="dxa" w:w="4968"/>
@@ -6494,6 +6690,9 @@
         </w:tc>
       </w:tr>
       <w:tr>
+        <w:trPr>
+          <w:cantSplit/>
+        </w:trPr>
         <w:tc>
           <w:tcPr>
             <w:tcW w:type="dxa" w:w="4968"/>
@@ -6558,6 +6757,9 @@
         </w:tc>
       </w:tr>
       <w:tr>
+        <w:trPr>
+          <w:cantSplit/>
+        </w:trPr>
         <w:tc>
           <w:tcPr>
             <w:tcW w:type="dxa" w:w="4968"/>
@@ -6620,6 +6822,9 @@
         </w:tc>
       </w:tr>
       <w:tr>
+        <w:trPr>
+          <w:cantSplit/>
+        </w:trPr>
         <w:tc>
           <w:tcPr>
             <w:tcW w:type="dxa" w:w="4968"/>

</xml_diff>